<commit_message>
Load test and mcp config
</commit_message>
<xml_diff>
--- a/deliverables/01_Technical_Design_Document.docx
+++ b/deliverables/01_Technical_Design_Document.docx
@@ -6421,6 +6421,2008 @@
         <w:t xml:space="preserve">    └── session_events.log</w:t>
       </w:r>
     </w:p>
+    <w:p>
+      <w:r>
+        <w:br w:type="page"/>
+      </w:r>
+    </w:p>
+    <w:p>
+      <w:pPr>
+        <w:pStyle w:val="Heading1"/>
+      </w:pPr>
+      <w:r>
+        <w:rPr>
+          <w:color w:val="003366"/>
+        </w:rPr>
+        <w:t>10. MCP &amp; Plugin Integration</w:t>
+      </w:r>
+    </w:p>
+    <w:p>
+      <w:r>
+        <w:rPr>
+          <w:b w:val="0"/>
+          <w:i w:val="0"/>
+          <w:sz w:val="22"/>
+        </w:rPr>
+        <w:t>The NexaBank Policy Assistant exposes its full knowledge base as a set of MCP (Model Context Protocol) tools via mcp_server.py. This allows any MCP-compatible client — including Claude Desktop, Claude Code, or a custom agentic pipeline — to query bank policies directly without running the Streamlit UI.</w:t>
+      </w:r>
+    </w:p>
+    <w:p>
+      <w:pPr>
+        <w:pStyle w:val="Heading2"/>
+      </w:pPr>
+      <w:r>
+        <w:rPr>
+          <w:color w:val="0066CC"/>
+        </w:rPr>
+        <w:t>10.1 What is MCP?</w:t>
+      </w:r>
+    </w:p>
+    <w:p>
+      <w:r>
+        <w:rPr>
+          <w:b w:val="0"/>
+          <w:i w:val="0"/>
+          <w:sz w:val="22"/>
+        </w:rPr>
+        <w:t>Model Context Protocol (MCP) is an open standard by Anthropic that lets AI applications expose tools and resources to language models in a uniform way. An MCP server defines tools with JSON Schema input/output contracts; any MCP-compatible client can discover and call those tools at runtime.</w:t>
+      </w:r>
+    </w:p>
+    <w:p>
+      <w:pPr>
+        <w:pStyle w:val="Heading2"/>
+      </w:pPr>
+      <w:r>
+        <w:rPr>
+          <w:color w:val="0066CC"/>
+        </w:rPr>
+        <w:t>10.2 MCP Server — nexabank-policy-assistant</w:t>
+      </w:r>
+    </w:p>
+    <w:p>
+      <w:r>
+        <w:rPr>
+          <w:b/>
+          <w:i w:val="0"/>
+          <w:sz w:val="22"/>
+        </w:rPr>
+        <w:t>File: bank_assistant/mcp_server.py</w:t>
+      </w:r>
+    </w:p>
+    <w:p>
+      <w:r>
+        <w:rPr>
+          <w:b w:val="0"/>
+          <w:i w:val="0"/>
+          <w:sz w:val="22"/>
+        </w:rPr>
+        <w:t>The server implements the MCP JSON-RPC 2.0 protocol over stdio (standard MCP transport). It loads all 5 policy documents at startup and exposes them as callable tools.</w:t>
+      </w:r>
+    </w:p>
+    <w:tbl>
+      <w:tblPr>
+        <w:tblStyle w:val="TableGrid"/>
+        <w:tblW w:type="auto" w:w="0"/>
+        <w:tblLook w:firstColumn="1" w:firstRow="1" w:lastColumn="0" w:lastRow="0" w:noHBand="0" w:noVBand="1" w:val="04A0"/>
+      </w:tblPr>
+      <w:tblGrid>
+        <w:gridCol w:w="2160"/>
+        <w:gridCol w:w="2160"/>
+        <w:gridCol w:w="2160"/>
+        <w:gridCol w:w="2160"/>
+      </w:tblGrid>
+      <w:tr>
+        <w:tc>
+          <w:tcPr>
+            <w:tcW w:type="dxa" w:w="2160"/>
+          </w:tcPr>
+          <w:p>
+            <w:r>
+              <w:rPr>
+                <w:b/>
+              </w:rPr>
+              <w:t>Tool Name</w:t>
+            </w:r>
+          </w:p>
+        </w:tc>
+        <w:tc>
+          <w:tcPr>
+            <w:tcW w:type="dxa" w:w="2160"/>
+          </w:tcPr>
+          <w:p>
+            <w:r>
+              <w:rPr>
+                <w:b/>
+              </w:rPr>
+              <w:t>Description</w:t>
+            </w:r>
+          </w:p>
+        </w:tc>
+        <w:tc>
+          <w:tcPr>
+            <w:tcW w:type="dxa" w:w="2160"/>
+          </w:tcPr>
+          <w:p>
+            <w:r>
+              <w:rPr>
+                <w:b/>
+              </w:rPr>
+              <w:t>Input</w:t>
+            </w:r>
+          </w:p>
+        </w:tc>
+        <w:tc>
+          <w:tcPr>
+            <w:tcW w:type="dxa" w:w="2160"/>
+          </w:tcPr>
+          <w:p>
+            <w:r>
+              <w:rPr>
+                <w:b/>
+              </w:rPr>
+              <w:t>Output</w:t>
+            </w:r>
+          </w:p>
+        </w:tc>
+      </w:tr>
+      <w:tr>
+        <w:tc>
+          <w:tcPr>
+            <w:tcW w:type="dxa" w:w="2160"/>
+          </w:tcPr>
+          <w:p/>
+        </w:tc>
+        <w:tc>
+          <w:tcPr>
+            <w:tcW w:type="dxa" w:w="2160"/>
+          </w:tcPr>
+          <w:p/>
+        </w:tc>
+        <w:tc>
+          <w:tcPr>
+            <w:tcW w:type="dxa" w:w="2160"/>
+          </w:tcPr>
+          <w:p/>
+        </w:tc>
+        <w:tc>
+          <w:tcPr>
+            <w:tcW w:type="dxa" w:w="2160"/>
+          </w:tcPr>
+          <w:p/>
+        </w:tc>
+      </w:tr>
+      <w:tr>
+        <w:tc>
+          <w:tcPr>
+            <w:tcW w:type="dxa" w:w="2160"/>
+          </w:tcPr>
+          <w:p/>
+        </w:tc>
+        <w:tc>
+          <w:tcPr>
+            <w:tcW w:type="dxa" w:w="2160"/>
+          </w:tcPr>
+          <w:p/>
+        </w:tc>
+        <w:tc>
+          <w:tcPr>
+            <w:tcW w:type="dxa" w:w="2160"/>
+          </w:tcPr>
+          <w:p/>
+        </w:tc>
+        <w:tc>
+          <w:tcPr>
+            <w:tcW w:type="dxa" w:w="2160"/>
+          </w:tcPr>
+          <w:p/>
+        </w:tc>
+      </w:tr>
+      <w:tr>
+        <w:tc>
+          <w:tcPr>
+            <w:tcW w:type="dxa" w:w="2160"/>
+          </w:tcPr>
+          <w:p/>
+        </w:tc>
+        <w:tc>
+          <w:tcPr>
+            <w:tcW w:type="dxa" w:w="2160"/>
+          </w:tcPr>
+          <w:p/>
+        </w:tc>
+        <w:tc>
+          <w:tcPr>
+            <w:tcW w:type="dxa" w:w="2160"/>
+          </w:tcPr>
+          <w:p/>
+        </w:tc>
+        <w:tc>
+          <w:tcPr>
+            <w:tcW w:type="dxa" w:w="2160"/>
+          </w:tcPr>
+          <w:p/>
+        </w:tc>
+      </w:tr>
+      <w:tr>
+        <w:tc>
+          <w:tcPr>
+            <w:tcW w:type="dxa" w:w="2160"/>
+          </w:tcPr>
+          <w:p/>
+        </w:tc>
+        <w:tc>
+          <w:tcPr>
+            <w:tcW w:type="dxa" w:w="2160"/>
+          </w:tcPr>
+          <w:p/>
+        </w:tc>
+        <w:tc>
+          <w:tcPr>
+            <w:tcW w:type="dxa" w:w="2160"/>
+          </w:tcPr>
+          <w:p/>
+        </w:tc>
+        <w:tc>
+          <w:tcPr>
+            <w:tcW w:type="dxa" w:w="2160"/>
+          </w:tcPr>
+          <w:p/>
+        </w:tc>
+      </w:tr>
+      <w:tr>
+        <w:tc>
+          <w:tcPr>
+            <w:tcW w:type="dxa" w:w="2160"/>
+          </w:tcPr>
+          <w:p/>
+        </w:tc>
+        <w:tc>
+          <w:tcPr>
+            <w:tcW w:type="dxa" w:w="2160"/>
+          </w:tcPr>
+          <w:p/>
+        </w:tc>
+        <w:tc>
+          <w:tcPr>
+            <w:tcW w:type="dxa" w:w="2160"/>
+          </w:tcPr>
+          <w:p/>
+        </w:tc>
+        <w:tc>
+          <w:tcPr>
+            <w:tcW w:type="dxa" w:w="2160"/>
+          </w:tcPr>
+          <w:p/>
+        </w:tc>
+      </w:tr>
+      <w:tr>
+        <w:tc>
+          <w:tcPr>
+            <w:tcW w:type="dxa" w:w="2160"/>
+          </w:tcPr>
+          <w:p>
+            <w:r>
+              <w:t>search_policy</w:t>
+            </w:r>
+          </w:p>
+        </w:tc>
+        <w:tc>
+          <w:tcPr>
+            <w:tcW w:type="dxa" w:w="2160"/>
+          </w:tcPr>
+          <w:p>
+            <w:r>
+              <w:t>Search knowledge base for best-matching policy snippet</w:t>
+            </w:r>
+          </w:p>
+        </w:tc>
+        <w:tc>
+          <w:tcPr>
+            <w:tcW w:type="dxa" w:w="2160"/>
+          </w:tcPr>
+          <w:p>
+            <w:r>
+              <w:t>question: string</w:t>
+            </w:r>
+          </w:p>
+        </w:tc>
+        <w:tc>
+          <w:tcPr>
+            <w:tcW w:type="dxa" w:w="2160"/>
+          </w:tcPr>
+          <w:p>
+            <w:r>
+              <w:t>found, answer, policy_name, policy_code, score</w:t>
+            </w:r>
+          </w:p>
+        </w:tc>
+      </w:tr>
+      <w:tr>
+        <w:tc>
+          <w:tcPr>
+            <w:tcW w:type="dxa" w:w="2160"/>
+          </w:tcPr>
+          <w:p>
+            <w:r>
+              <w:t>list_policies</w:t>
+            </w:r>
+          </w:p>
+        </w:tc>
+        <w:tc>
+          <w:tcPr>
+            <w:tcW w:type="dxa" w:w="2160"/>
+          </w:tcPr>
+          <w:p>
+            <w:r>
+              <w:t>List all available policy documents with codes</w:t>
+            </w:r>
+          </w:p>
+        </w:tc>
+        <w:tc>
+          <w:tcPr>
+            <w:tcW w:type="dxa" w:w="2160"/>
+          </w:tcPr>
+          <w:p>
+            <w:r>
+              <w:t>(none)</w:t>
+            </w:r>
+          </w:p>
+        </w:tc>
+        <w:tc>
+          <w:tcPr>
+            <w:tcW w:type="dxa" w:w="2160"/>
+          </w:tcPr>
+          <w:p>
+            <w:r>
+              <w:t>policies[]: {code, name, sample_topics}</w:t>
+            </w:r>
+          </w:p>
+        </w:tc>
+      </w:tr>
+      <w:tr>
+        <w:tc>
+          <w:tcPr>
+            <w:tcW w:type="dxa" w:w="2160"/>
+          </w:tcPr>
+          <w:p>
+            <w:r>
+              <w:t>get_policy_full</w:t>
+            </w:r>
+          </w:p>
+        </w:tc>
+        <w:tc>
+          <w:tcPr>
+            <w:tcW w:type="dxa" w:w="2160"/>
+          </w:tcPr>
+          <w:p>
+            <w:r>
+              <w:t>Return the complete text of one policy by code</w:t>
+            </w:r>
+          </w:p>
+        </w:tc>
+        <w:tc>
+          <w:tcPr>
+            <w:tcW w:type="dxa" w:w="2160"/>
+          </w:tcPr>
+          <w:p>
+            <w:r>
+              <w:t>policy_code: LP-001 | KYC-002 | CCP-003 | CCP-004 | AOP-005</w:t>
+            </w:r>
+          </w:p>
+        </w:tc>
+        <w:tc>
+          <w:tcPr>
+            <w:tcW w:type="dxa" w:w="2160"/>
+          </w:tcPr>
+          <w:p>
+            <w:r>
+              <w:t>found, policy_name, text, char_count</w:t>
+            </w:r>
+          </w:p>
+        </w:tc>
+      </w:tr>
+      <w:tr>
+        <w:tc>
+          <w:tcPr>
+            <w:tcW w:type="dxa" w:w="2160"/>
+          </w:tcPr>
+          <w:p>
+            <w:r>
+              <w:t>cross_reference</w:t>
+            </w:r>
+          </w:p>
+        </w:tc>
+        <w:tc>
+          <w:tcPr>
+            <w:tcW w:type="dxa" w:w="2160"/>
+          </w:tcPr>
+          <w:p>
+            <w:r>
+              <w:t>Find all policies relevant to a multi-domain question</w:t>
+            </w:r>
+          </w:p>
+        </w:tc>
+        <w:tc>
+          <w:tcPr>
+            <w:tcW w:type="dxa" w:w="2160"/>
+          </w:tcPr>
+          <w:p>
+            <w:r>
+              <w:t>question: string</w:t>
+            </w:r>
+          </w:p>
+        </w:tc>
+        <w:tc>
+          <w:tcPr>
+            <w:tcW w:type="dxa" w:w="2160"/>
+          </w:tcPr>
+          <w:p>
+            <w:r>
+              <w:t>matches[]: {policy_name, policy_code, score, snippet}</w:t>
+            </w:r>
+          </w:p>
+        </w:tc>
+      </w:tr>
+      <w:tr>
+        <w:tc>
+          <w:tcPr>
+            <w:tcW w:type="dxa" w:w="2160"/>
+          </w:tcPr>
+          <w:p>
+            <w:r>
+              <w:t>check_compliance_risk</w:t>
+            </w:r>
+          </w:p>
+        </w:tc>
+        <w:tc>
+          <w:tcPr>
+            <w:tcW w:type="dxa" w:w="2160"/>
+          </w:tcPr>
+          <w:p>
+            <w:r>
+              <w:t>Screen question for 14 compliance risk keywords</w:t>
+            </w:r>
+          </w:p>
+        </w:tc>
+        <w:tc>
+          <w:tcPr>
+            <w:tcW w:type="dxa" w:w="2160"/>
+          </w:tcPr>
+          <w:p>
+            <w:r>
+              <w:t>question: string</w:t>
+            </w:r>
+          </w:p>
+        </w:tc>
+        <w:tc>
+          <w:tcPr>
+            <w:tcW w:type="dxa" w:w="2160"/>
+          </w:tcPr>
+          <w:p>
+            <w:r>
+              <w:t>is_compliance_risk, matched_keywords, alert</w:t>
+            </w:r>
+          </w:p>
+        </w:tc>
+      </w:tr>
+    </w:tbl>
+    <w:p>
+      <w:pPr>
+        <w:pStyle w:val="Heading2"/>
+      </w:pPr>
+      <w:r>
+        <w:rPr>
+          <w:color w:val="0066CC"/>
+        </w:rPr>
+        <w:t>10.3 MCP Protocol Support</w:t>
+      </w:r>
+    </w:p>
+    <w:tbl>
+      <w:tblPr>
+        <w:tblStyle w:val="TableGrid"/>
+        <w:tblW w:type="auto" w:w="0"/>
+        <w:tblLook w:firstColumn="1" w:firstRow="1" w:lastColumn="0" w:lastRow="0" w:noHBand="0" w:noVBand="1" w:val="04A0"/>
+      </w:tblPr>
+      <w:tblGrid>
+        <w:gridCol w:w="2880"/>
+        <w:gridCol w:w="2880"/>
+        <w:gridCol w:w="2880"/>
+      </w:tblGrid>
+      <w:tr>
+        <w:tc>
+          <w:tcPr>
+            <w:tcW w:type="dxa" w:w="2880"/>
+          </w:tcPr>
+          <w:p>
+            <w:r>
+              <w:rPr>
+                <w:b/>
+              </w:rPr>
+              <w:t>MCP Method</w:t>
+            </w:r>
+          </w:p>
+        </w:tc>
+        <w:tc>
+          <w:tcPr>
+            <w:tcW w:type="dxa" w:w="2880"/>
+          </w:tcPr>
+          <w:p>
+            <w:r>
+              <w:rPr>
+                <w:b/>
+              </w:rPr>
+              <w:t>Status</w:t>
+            </w:r>
+          </w:p>
+        </w:tc>
+        <w:tc>
+          <w:tcPr>
+            <w:tcW w:type="dxa" w:w="2880"/>
+          </w:tcPr>
+          <w:p>
+            <w:r>
+              <w:rPr>
+                <w:b/>
+              </w:rPr>
+              <w:t>Notes</w:t>
+            </w:r>
+          </w:p>
+        </w:tc>
+      </w:tr>
+      <w:tr>
+        <w:tc>
+          <w:tcPr>
+            <w:tcW w:type="dxa" w:w="2880"/>
+          </w:tcPr>
+          <w:p/>
+        </w:tc>
+        <w:tc>
+          <w:tcPr>
+            <w:tcW w:type="dxa" w:w="2880"/>
+          </w:tcPr>
+          <w:p/>
+        </w:tc>
+        <w:tc>
+          <w:tcPr>
+            <w:tcW w:type="dxa" w:w="2880"/>
+          </w:tcPr>
+          <w:p/>
+        </w:tc>
+      </w:tr>
+      <w:tr>
+        <w:tc>
+          <w:tcPr>
+            <w:tcW w:type="dxa" w:w="2880"/>
+          </w:tcPr>
+          <w:p/>
+        </w:tc>
+        <w:tc>
+          <w:tcPr>
+            <w:tcW w:type="dxa" w:w="2880"/>
+          </w:tcPr>
+          <w:p/>
+        </w:tc>
+        <w:tc>
+          <w:tcPr>
+            <w:tcW w:type="dxa" w:w="2880"/>
+          </w:tcPr>
+          <w:p/>
+        </w:tc>
+      </w:tr>
+      <w:tr>
+        <w:tc>
+          <w:tcPr>
+            <w:tcW w:type="dxa" w:w="2880"/>
+          </w:tcPr>
+          <w:p/>
+        </w:tc>
+        <w:tc>
+          <w:tcPr>
+            <w:tcW w:type="dxa" w:w="2880"/>
+          </w:tcPr>
+          <w:p/>
+        </w:tc>
+        <w:tc>
+          <w:tcPr>
+            <w:tcW w:type="dxa" w:w="2880"/>
+          </w:tcPr>
+          <w:p/>
+        </w:tc>
+      </w:tr>
+      <w:tr>
+        <w:tc>
+          <w:tcPr>
+            <w:tcW w:type="dxa" w:w="2880"/>
+          </w:tcPr>
+          <w:p/>
+        </w:tc>
+        <w:tc>
+          <w:tcPr>
+            <w:tcW w:type="dxa" w:w="2880"/>
+          </w:tcPr>
+          <w:p/>
+        </w:tc>
+        <w:tc>
+          <w:tcPr>
+            <w:tcW w:type="dxa" w:w="2880"/>
+          </w:tcPr>
+          <w:p/>
+        </w:tc>
+      </w:tr>
+      <w:tr>
+        <w:tc>
+          <w:tcPr>
+            <w:tcW w:type="dxa" w:w="2880"/>
+          </w:tcPr>
+          <w:p>
+            <w:r>
+              <w:t>initialize</w:t>
+            </w:r>
+          </w:p>
+        </w:tc>
+        <w:tc>
+          <w:tcPr>
+            <w:tcW w:type="dxa" w:w="2880"/>
+          </w:tcPr>
+          <w:p>
+            <w:r>
+              <w:t>Implemented</w:t>
+            </w:r>
+          </w:p>
+        </w:tc>
+        <w:tc>
+          <w:tcPr>
+            <w:tcW w:type="dxa" w:w="2880"/>
+          </w:tcPr>
+          <w:p>
+            <w:r>
+              <w:t>Returns server name, version, capabilities</w:t>
+            </w:r>
+          </w:p>
+        </w:tc>
+      </w:tr>
+      <w:tr>
+        <w:tc>
+          <w:tcPr>
+            <w:tcW w:type="dxa" w:w="2880"/>
+          </w:tcPr>
+          <w:p>
+            <w:r>
+              <w:t>tools/list</w:t>
+            </w:r>
+          </w:p>
+        </w:tc>
+        <w:tc>
+          <w:tcPr>
+            <w:tcW w:type="dxa" w:w="2880"/>
+          </w:tcPr>
+          <w:p>
+            <w:r>
+              <w:t>Implemented</w:t>
+            </w:r>
+          </w:p>
+        </w:tc>
+        <w:tc>
+          <w:tcPr>
+            <w:tcW w:type="dxa" w:w="2880"/>
+          </w:tcPr>
+          <w:p>
+            <w:r>
+              <w:t>Returns all 5 tool schemas</w:t>
+            </w:r>
+          </w:p>
+        </w:tc>
+      </w:tr>
+      <w:tr>
+        <w:tc>
+          <w:tcPr>
+            <w:tcW w:type="dxa" w:w="2880"/>
+          </w:tcPr>
+          <w:p>
+            <w:r>
+              <w:t>tools/call</w:t>
+            </w:r>
+          </w:p>
+        </w:tc>
+        <w:tc>
+          <w:tcPr>
+            <w:tcW w:type="dxa" w:w="2880"/>
+          </w:tcPr>
+          <w:p>
+            <w:r>
+              <w:t>Implemented</w:t>
+            </w:r>
+          </w:p>
+        </w:tc>
+        <w:tc>
+          <w:tcPr>
+            <w:tcW w:type="dxa" w:w="2880"/>
+          </w:tcPr>
+          <w:p>
+            <w:r>
+              <w:t>Dispatches to handler, returns JSON result</w:t>
+            </w:r>
+          </w:p>
+        </w:tc>
+      </w:tr>
+      <w:tr>
+        <w:tc>
+          <w:tcPr>
+            <w:tcW w:type="dxa" w:w="2880"/>
+          </w:tcPr>
+          <w:p>
+            <w:r>
+              <w:t>notifications/*</w:t>
+            </w:r>
+          </w:p>
+        </w:tc>
+        <w:tc>
+          <w:tcPr>
+            <w:tcW w:type="dxa" w:w="2880"/>
+          </w:tcPr>
+          <w:p>
+            <w:r>
+              <w:t>Implemented</w:t>
+            </w:r>
+          </w:p>
+        </w:tc>
+        <w:tc>
+          <w:tcPr>
+            <w:tcW w:type="dxa" w:w="2880"/>
+          </w:tcPr>
+          <w:p>
+            <w:r>
+              <w:t>Gracefully ignores all notification messages</w:t>
+            </w:r>
+          </w:p>
+        </w:tc>
+      </w:tr>
+    </w:tbl>
+    <w:p>
+      <w:pPr>
+        <w:pStyle w:val="Heading2"/>
+      </w:pPr>
+      <w:r>
+        <w:rPr>
+          <w:color w:val="0066CC"/>
+        </w:rPr>
+        <w:t>10.4 Claude Desktop Registration</w:t>
+      </w:r>
+    </w:p>
+    <w:p>
+      <w:r>
+        <w:rPr>
+          <w:b/>
+          <w:i w:val="0"/>
+          <w:sz w:val="22"/>
+        </w:rPr>
+        <w:t>File: bank_assistant/claude_mcp_config.json</w:t>
+      </w:r>
+    </w:p>
+    <w:p>
+      <w:r>
+        <w:rPr>
+          <w:b w:val="0"/>
+          <w:i w:val="0"/>
+          <w:sz w:val="22"/>
+        </w:rPr>
+        <w:t>To register the server with Claude Desktop or Claude Code, add the following block to the claude_desktop_config.json (MacOS: ~/Library/Application Support/Claude/claude_desktop_config.json, Windows: %APPDATA%\Claude\claude_desktop_config.json):</w:t>
+      </w:r>
+    </w:p>
+    <w:p>
+      <w:r>
+        <w:rPr>
+          <w:b w:val="0"/>
+          <w:i w:val="0"/>
+          <w:sz w:val="22"/>
+        </w:rPr>
+        <w:t>{</w:t>
+        <w:br/>
+        <w:t xml:space="preserve">  "mcpServers": {</w:t>
+        <w:br/>
+        <w:t xml:space="preserve">    "nexabank-policy-assistant": {</w:t>
+        <w:br/>
+        <w:t xml:space="preserve">      "command": "python",</w:t>
+        <w:br/>
+        <w:t xml:space="preserve">      "args": ["mcp_server.py"],</w:t>
+        <w:br/>
+        <w:t xml:space="preserve">      "cwd": "/path/to/CapstoneProject/bank_assistant"</w:t>
+        <w:br/>
+        <w:t xml:space="preserve">    }</w:t>
+        <w:br/>
+        <w:t xml:space="preserve">  }</w:t>
+        <w:br/>
+        <w:t>}</w:t>
+      </w:r>
+    </w:p>
+    <w:p>
+      <w:r>
+        <w:rPr>
+          <w:b w:val="0"/>
+          <w:i w:val="0"/>
+          <w:sz w:val="22"/>
+        </w:rPr>
+        <w:t>Once registered, Claude and other MCP clients can call search_policy, list_policies, get_policy_full, cross_reference, and check_compliance_risk directly — no Streamlit session required.</w:t>
+      </w:r>
+    </w:p>
+    <w:p>
+      <w:pPr>
+        <w:pStyle w:val="Heading2"/>
+      </w:pPr>
+      <w:r>
+        <w:rPr>
+          <w:color w:val="0066CC"/>
+        </w:rPr>
+        <w:t>10.5 Integration Architecture</w:t>
+      </w:r>
+    </w:p>
+    <w:p>
+      <w:r>
+        <w:rPr>
+          <w:b/>
+          <w:i w:val="0"/>
+          <w:sz w:val="22"/>
+        </w:rPr>
+        <w:t>Two deployment modes are now supported side by side:</w:t>
+      </w:r>
+    </w:p>
+    <w:tbl>
+      <w:tblPr>
+        <w:tblStyle w:val="TableGrid"/>
+        <w:tblW w:type="auto" w:w="0"/>
+        <w:tblLook w:firstColumn="1" w:firstRow="1" w:lastColumn="0" w:lastRow="0" w:noHBand="0" w:noVBand="1" w:val="04A0"/>
+      </w:tblPr>
+      <w:tblGrid>
+        <w:gridCol w:w="2160"/>
+        <w:gridCol w:w="2160"/>
+        <w:gridCol w:w="2160"/>
+        <w:gridCol w:w="2160"/>
+      </w:tblGrid>
+      <w:tr>
+        <w:tc>
+          <w:tcPr>
+            <w:tcW w:type="dxa" w:w="2160"/>
+          </w:tcPr>
+          <w:p>
+            <w:r>
+              <w:rPr>
+                <w:b/>
+              </w:rPr>
+              <w:t>Mode</w:t>
+            </w:r>
+          </w:p>
+        </w:tc>
+        <w:tc>
+          <w:tcPr>
+            <w:tcW w:type="dxa" w:w="2160"/>
+          </w:tcPr>
+          <w:p>
+            <w:r>
+              <w:rPr>
+                <w:b/>
+              </w:rPr>
+              <w:t>Entry Point</w:t>
+            </w:r>
+          </w:p>
+        </w:tc>
+        <w:tc>
+          <w:tcPr>
+            <w:tcW w:type="dxa" w:w="2160"/>
+          </w:tcPr>
+          <w:p>
+            <w:r>
+              <w:rPr>
+                <w:b/>
+              </w:rPr>
+              <w:t>Clients</w:t>
+            </w:r>
+          </w:p>
+        </w:tc>
+        <w:tc>
+          <w:tcPr>
+            <w:tcW w:type="dxa" w:w="2160"/>
+          </w:tcPr>
+          <w:p>
+            <w:r>
+              <w:rPr>
+                <w:b/>
+              </w:rPr>
+              <w:t>Use Case</w:t>
+            </w:r>
+          </w:p>
+        </w:tc>
+      </w:tr>
+      <w:tr>
+        <w:tc>
+          <w:tcPr>
+            <w:tcW w:type="dxa" w:w="2160"/>
+          </w:tcPr>
+          <w:p/>
+        </w:tc>
+        <w:tc>
+          <w:tcPr>
+            <w:tcW w:type="dxa" w:w="2160"/>
+          </w:tcPr>
+          <w:p/>
+        </w:tc>
+        <w:tc>
+          <w:tcPr>
+            <w:tcW w:type="dxa" w:w="2160"/>
+          </w:tcPr>
+          <w:p/>
+        </w:tc>
+        <w:tc>
+          <w:tcPr>
+            <w:tcW w:type="dxa" w:w="2160"/>
+          </w:tcPr>
+          <w:p/>
+        </w:tc>
+      </w:tr>
+      <w:tr>
+        <w:tc>
+          <w:tcPr>
+            <w:tcW w:type="dxa" w:w="2160"/>
+          </w:tcPr>
+          <w:p/>
+        </w:tc>
+        <w:tc>
+          <w:tcPr>
+            <w:tcW w:type="dxa" w:w="2160"/>
+          </w:tcPr>
+          <w:p/>
+        </w:tc>
+        <w:tc>
+          <w:tcPr>
+            <w:tcW w:type="dxa" w:w="2160"/>
+          </w:tcPr>
+          <w:p/>
+        </w:tc>
+        <w:tc>
+          <w:tcPr>
+            <w:tcW w:type="dxa" w:w="2160"/>
+          </w:tcPr>
+          <w:p/>
+        </w:tc>
+      </w:tr>
+      <w:tr>
+        <w:tc>
+          <w:tcPr>
+            <w:tcW w:type="dxa" w:w="2160"/>
+          </w:tcPr>
+          <w:p>
+            <w:r>
+              <w:t>Streamlit UI</w:t>
+            </w:r>
+          </w:p>
+        </w:tc>
+        <w:tc>
+          <w:tcPr>
+            <w:tcW w:type="dxa" w:w="2160"/>
+          </w:tcPr>
+          <w:p>
+            <w:r>
+              <w:t>app.py</w:t>
+            </w:r>
+          </w:p>
+        </w:tc>
+        <w:tc>
+          <w:tcPr>
+            <w:tcW w:type="dxa" w:w="2160"/>
+          </w:tcPr>
+          <w:p>
+            <w:r>
+              <w:t>Browser</w:t>
+            </w:r>
+          </w:p>
+        </w:tc>
+        <w:tc>
+          <w:tcPr>
+            <w:tcW w:type="dxa" w:w="2160"/>
+          </w:tcPr>
+          <w:p>
+            <w:r>
+              <w:t>Bank employees using chat interface</w:t>
+            </w:r>
+          </w:p>
+        </w:tc>
+      </w:tr>
+      <w:tr>
+        <w:tc>
+          <w:tcPr>
+            <w:tcW w:type="dxa" w:w="2160"/>
+          </w:tcPr>
+          <w:p>
+            <w:r>
+              <w:t>MCP Server</w:t>
+            </w:r>
+          </w:p>
+        </w:tc>
+        <w:tc>
+          <w:tcPr>
+            <w:tcW w:type="dxa" w:w="2160"/>
+          </w:tcPr>
+          <w:p>
+            <w:r>
+              <w:t>mcp_server.py</w:t>
+            </w:r>
+          </w:p>
+        </w:tc>
+        <w:tc>
+          <w:tcPr>
+            <w:tcW w:type="dxa" w:w="2160"/>
+          </w:tcPr>
+          <w:p>
+            <w:r>
+              <w:t>Claude Desktop, Claude Code, custom agents</w:t>
+            </w:r>
+          </w:p>
+        </w:tc>
+        <w:tc>
+          <w:tcPr>
+            <w:tcW w:type="dxa" w:w="2160"/>
+          </w:tcPr>
+          <w:p>
+            <w:r>
+              <w:t>Developer/AI agent direct tool access</w:t>
+            </w:r>
+          </w:p>
+        </w:tc>
+      </w:tr>
+    </w:tbl>
+    <w:p>
+      <w:r>
+        <w:rPr>
+          <w:b w:val="0"/>
+          <w:i w:val="0"/>
+          <w:sz w:val="22"/>
+        </w:rPr>
+        <w:t>Both modes share the same knowledge base (policies/), the same KEYWORD_MAP scoring logic, and the same skills layer — ensuring consistency regardless of how the system is accessed.</w:t>
+      </w:r>
+    </w:p>
+    <w:p>
+      <w:r>
+        <w:br w:type="page"/>
+      </w:r>
+    </w:p>
+    <w:p>
+      <w:pPr>
+        <w:pStyle w:val="Heading1"/>
+      </w:pPr>
+      <w:r>
+        <w:rPr>
+          <w:color w:val="003366"/>
+        </w:rPr>
+        <w:t>11. Business Impact</w:t>
+      </w:r>
+    </w:p>
+    <w:p>
+      <w:r>
+        <w:rPr>
+          <w:b w:val="0"/>
+          <w:i w:val="0"/>
+          <w:sz w:val="22"/>
+        </w:rPr>
+        <w:t>The Internal Bank Employee Assistant delivers measurable value across productivity, compliance, and operational efficiency.</w:t>
+      </w:r>
+    </w:p>
+    <w:tbl>
+      <w:tblPr>
+        <w:tblStyle w:val="TableGrid"/>
+        <w:tblW w:type="auto" w:w="0"/>
+        <w:tblLook w:firstColumn="1" w:firstRow="1" w:lastColumn="0" w:lastRow="0" w:noHBand="0" w:noVBand="1" w:val="04A0"/>
+      </w:tblPr>
+      <w:tblGrid>
+        <w:gridCol w:w="2160"/>
+        <w:gridCol w:w="2160"/>
+        <w:gridCol w:w="2160"/>
+        <w:gridCol w:w="2160"/>
+      </w:tblGrid>
+      <w:tr>
+        <w:tc>
+          <w:tcPr>
+            <w:tcW w:type="dxa" w:w="2160"/>
+          </w:tcPr>
+          <w:p>
+            <w:r>
+              <w:rPr>
+                <w:b/>
+              </w:rPr>
+              <w:t>Impact Area</w:t>
+            </w:r>
+          </w:p>
+        </w:tc>
+        <w:tc>
+          <w:tcPr>
+            <w:tcW w:type="dxa" w:w="2160"/>
+          </w:tcPr>
+          <w:p>
+            <w:r>
+              <w:rPr>
+                <w:b/>
+              </w:rPr>
+              <w:t>Before</w:t>
+            </w:r>
+          </w:p>
+        </w:tc>
+        <w:tc>
+          <w:tcPr>
+            <w:tcW w:type="dxa" w:w="2160"/>
+          </w:tcPr>
+          <w:p>
+            <w:r>
+              <w:rPr>
+                <w:b/>
+              </w:rPr>
+              <w:t>After</w:t>
+            </w:r>
+          </w:p>
+        </w:tc>
+        <w:tc>
+          <w:tcPr>
+            <w:tcW w:type="dxa" w:w="2160"/>
+          </w:tcPr>
+          <w:p>
+            <w:r>
+              <w:rPr>
+                <w:b/>
+              </w:rPr>
+              <w:t>Improvement</w:t>
+            </w:r>
+          </w:p>
+        </w:tc>
+      </w:tr>
+      <w:tr>
+        <w:tc>
+          <w:tcPr>
+            <w:tcW w:type="dxa" w:w="2160"/>
+          </w:tcPr>
+          <w:p/>
+        </w:tc>
+        <w:tc>
+          <w:tcPr>
+            <w:tcW w:type="dxa" w:w="2160"/>
+          </w:tcPr>
+          <w:p/>
+        </w:tc>
+        <w:tc>
+          <w:tcPr>
+            <w:tcW w:type="dxa" w:w="2160"/>
+          </w:tcPr>
+          <w:p/>
+        </w:tc>
+        <w:tc>
+          <w:tcPr>
+            <w:tcW w:type="dxa" w:w="2160"/>
+          </w:tcPr>
+          <w:p/>
+        </w:tc>
+      </w:tr>
+      <w:tr>
+        <w:tc>
+          <w:tcPr>
+            <w:tcW w:type="dxa" w:w="2160"/>
+          </w:tcPr>
+          <w:p/>
+        </w:tc>
+        <w:tc>
+          <w:tcPr>
+            <w:tcW w:type="dxa" w:w="2160"/>
+          </w:tcPr>
+          <w:p/>
+        </w:tc>
+        <w:tc>
+          <w:tcPr>
+            <w:tcW w:type="dxa" w:w="2160"/>
+          </w:tcPr>
+          <w:p/>
+        </w:tc>
+        <w:tc>
+          <w:tcPr>
+            <w:tcW w:type="dxa" w:w="2160"/>
+          </w:tcPr>
+          <w:p/>
+        </w:tc>
+      </w:tr>
+      <w:tr>
+        <w:tc>
+          <w:tcPr>
+            <w:tcW w:type="dxa" w:w="2160"/>
+          </w:tcPr>
+          <w:p/>
+        </w:tc>
+        <w:tc>
+          <w:tcPr>
+            <w:tcW w:type="dxa" w:w="2160"/>
+          </w:tcPr>
+          <w:p/>
+        </w:tc>
+        <w:tc>
+          <w:tcPr>
+            <w:tcW w:type="dxa" w:w="2160"/>
+          </w:tcPr>
+          <w:p/>
+        </w:tc>
+        <w:tc>
+          <w:tcPr>
+            <w:tcW w:type="dxa" w:w="2160"/>
+          </w:tcPr>
+          <w:p/>
+        </w:tc>
+      </w:tr>
+      <w:tr>
+        <w:tc>
+          <w:tcPr>
+            <w:tcW w:type="dxa" w:w="2160"/>
+          </w:tcPr>
+          <w:p/>
+        </w:tc>
+        <w:tc>
+          <w:tcPr>
+            <w:tcW w:type="dxa" w:w="2160"/>
+          </w:tcPr>
+          <w:p/>
+        </w:tc>
+        <w:tc>
+          <w:tcPr>
+            <w:tcW w:type="dxa" w:w="2160"/>
+          </w:tcPr>
+          <w:p/>
+        </w:tc>
+        <w:tc>
+          <w:tcPr>
+            <w:tcW w:type="dxa" w:w="2160"/>
+          </w:tcPr>
+          <w:p/>
+        </w:tc>
+      </w:tr>
+      <w:tr>
+        <w:tc>
+          <w:tcPr>
+            <w:tcW w:type="dxa" w:w="2160"/>
+          </w:tcPr>
+          <w:p/>
+        </w:tc>
+        <w:tc>
+          <w:tcPr>
+            <w:tcW w:type="dxa" w:w="2160"/>
+          </w:tcPr>
+          <w:p/>
+        </w:tc>
+        <w:tc>
+          <w:tcPr>
+            <w:tcW w:type="dxa" w:w="2160"/>
+          </w:tcPr>
+          <w:p/>
+        </w:tc>
+        <w:tc>
+          <w:tcPr>
+            <w:tcW w:type="dxa" w:w="2160"/>
+          </w:tcPr>
+          <w:p/>
+        </w:tc>
+      </w:tr>
+      <w:tr>
+        <w:tc>
+          <w:tcPr>
+            <w:tcW w:type="dxa" w:w="2160"/>
+          </w:tcPr>
+          <w:p/>
+        </w:tc>
+        <w:tc>
+          <w:tcPr>
+            <w:tcW w:type="dxa" w:w="2160"/>
+          </w:tcPr>
+          <w:p/>
+        </w:tc>
+        <w:tc>
+          <w:tcPr>
+            <w:tcW w:type="dxa" w:w="2160"/>
+          </w:tcPr>
+          <w:p/>
+        </w:tc>
+        <w:tc>
+          <w:tcPr>
+            <w:tcW w:type="dxa" w:w="2160"/>
+          </w:tcPr>
+          <w:p/>
+        </w:tc>
+      </w:tr>
+      <w:tr>
+        <w:tc>
+          <w:tcPr>
+            <w:tcW w:type="dxa" w:w="2160"/>
+          </w:tcPr>
+          <w:p/>
+        </w:tc>
+        <w:tc>
+          <w:tcPr>
+            <w:tcW w:type="dxa" w:w="2160"/>
+          </w:tcPr>
+          <w:p/>
+        </w:tc>
+        <w:tc>
+          <w:tcPr>
+            <w:tcW w:type="dxa" w:w="2160"/>
+          </w:tcPr>
+          <w:p/>
+        </w:tc>
+        <w:tc>
+          <w:tcPr>
+            <w:tcW w:type="dxa" w:w="2160"/>
+          </w:tcPr>
+          <w:p/>
+        </w:tc>
+      </w:tr>
+      <w:tr>
+        <w:tc>
+          <w:tcPr>
+            <w:tcW w:type="dxa" w:w="2160"/>
+          </w:tcPr>
+          <w:p>
+            <w:r>
+              <w:t>Policy lookup time</w:t>
+            </w:r>
+          </w:p>
+        </w:tc>
+        <w:tc>
+          <w:tcPr>
+            <w:tcW w:type="dxa" w:w="2160"/>
+          </w:tcPr>
+          <w:p>
+            <w:r>
+              <w:t>5–15 min (manual document search)</w:t>
+            </w:r>
+          </w:p>
+        </w:tc>
+        <w:tc>
+          <w:tcPr>
+            <w:tcW w:type="dxa" w:w="2160"/>
+          </w:tcPr>
+          <w:p>
+            <w:r>
+              <w:t>&lt; 1 second (instant answer)</w:t>
+            </w:r>
+          </w:p>
+        </w:tc>
+        <w:tc>
+          <w:tcPr>
+            <w:tcW w:type="dxa" w:w="2160"/>
+          </w:tcPr>
+          <w:p>
+            <w:r>
+              <w:t>~95% time reduction</w:t>
+            </w:r>
+          </w:p>
+        </w:tc>
+      </w:tr>
+      <w:tr>
+        <w:tc>
+          <w:tcPr>
+            <w:tcW w:type="dxa" w:w="2160"/>
+          </w:tcPr>
+          <w:p>
+            <w:r>
+              <w:t>Answer consistency</w:t>
+            </w:r>
+          </w:p>
+        </w:tc>
+        <w:tc>
+          <w:tcPr>
+            <w:tcW w:type="dxa" w:w="2160"/>
+          </w:tcPr>
+          <w:p>
+            <w:r>
+              <w:t>Variable — depends on employee knowledge</w:t>
+            </w:r>
+          </w:p>
+        </w:tc>
+        <w:tc>
+          <w:tcPr>
+            <w:tcW w:type="dxa" w:w="2160"/>
+          </w:tcPr>
+          <w:p>
+            <w:r>
+              <w:t>Uniform — sourced from approved policy text</w:t>
+            </w:r>
+          </w:p>
+        </w:tc>
+        <w:tc>
+          <w:tcPr>
+            <w:tcW w:type="dxa" w:w="2160"/>
+          </w:tcPr>
+          <w:p>
+            <w:r>
+              <w:t>100% policy-compliant answers</w:t>
+            </w:r>
+          </w:p>
+        </w:tc>
+      </w:tr>
+      <w:tr>
+        <w:tc>
+          <w:tcPr>
+            <w:tcW w:type="dxa" w:w="2160"/>
+          </w:tcPr>
+          <w:p>
+            <w:r>
+              <w:t>Compliance risk detection</w:t>
+            </w:r>
+          </w:p>
+        </w:tc>
+        <w:tc>
+          <w:tcPr>
+            <w:tcW w:type="dxa" w:w="2160"/>
+          </w:tcPr>
+          <w:p>
+            <w:r>
+              <w:t>None — no automated screening</w:t>
+            </w:r>
+          </w:p>
+        </w:tc>
+        <w:tc>
+          <w:tcPr>
+            <w:tcW w:type="dxa" w:w="2160"/>
+          </w:tcPr>
+          <w:p>
+            <w:r>
+              <w:t>14 risk keywords flagged and logged in real time</w:t>
+            </w:r>
+          </w:p>
+        </w:tc>
+        <w:tc>
+          <w:tcPr>
+            <w:tcW w:type="dxa" w:w="2160"/>
+          </w:tcPr>
+          <w:p>
+            <w:r>
+              <w:t>Proactive compliance monitoring</w:t>
+            </w:r>
+          </w:p>
+        </w:tc>
+      </w:tr>
+      <w:tr>
+        <w:tc>
+          <w:tcPr>
+            <w:tcW w:type="dxa" w:w="2160"/>
+          </w:tcPr>
+          <w:p>
+            <w:r>
+              <w:t>Escalation handling</w:t>
+            </w:r>
+          </w:p>
+        </w:tc>
+        <w:tc>
+          <w:tcPr>
+            <w:tcW w:type="dxa" w:w="2160"/>
+          </w:tcPr>
+          <w:p>
+            <w:r>
+              <w:t>Manual — employee finds contact details</w:t>
+            </w:r>
+          </w:p>
+        </w:tc>
+        <w:tc>
+          <w:tcPr>
+            <w:tcW w:type="dxa" w:w="2160"/>
+          </w:tcPr>
+          <w:p>
+            <w:r>
+              <w:t>Automated — escalation agent drafts email</w:t>
+            </w:r>
+          </w:p>
+        </w:tc>
+        <w:tc>
+          <w:tcPr>
+            <w:tcW w:type="dxa" w:w="2160"/>
+          </w:tcPr>
+          <w:p>
+            <w:r>
+              <w:t>Faster issue resolution</w:t>
+            </w:r>
+          </w:p>
+        </w:tc>
+      </w:tr>
+      <w:tr>
+        <w:tc>
+          <w:tcPr>
+            <w:tcW w:type="dxa" w:w="2160"/>
+          </w:tcPr>
+          <w:p>
+            <w:r>
+              <w:t>Deployment cost</w:t>
+            </w:r>
+          </w:p>
+        </w:tc>
+        <w:tc>
+          <w:tcPr>
+            <w:tcW w:type="dxa" w:w="2160"/>
+          </w:tcPr>
+          <w:p>
+            <w:r>
+              <w:t>N/A</w:t>
+            </w:r>
+          </w:p>
+        </w:tc>
+        <w:tc>
+          <w:tcPr>
+            <w:tcW w:type="dxa" w:w="2160"/>
+          </w:tcPr>
+          <w:p>
+            <w:r>
+              <w:t>Zero cloud cost — runs on any internal server</w:t>
+            </w:r>
+          </w:p>
+        </w:tc>
+        <w:tc>
+          <w:tcPr>
+            <w:tcW w:type="dxa" w:w="2160"/>
+          </w:tcPr>
+          <w:p>
+            <w:r>
+              <w:t>Offline-first, no API fees</w:t>
+            </w:r>
+          </w:p>
+        </w:tc>
+      </w:tr>
+      <w:tr>
+        <w:tc>
+          <w:tcPr>
+            <w:tcW w:type="dxa" w:w="2160"/>
+          </w:tcPr>
+          <w:p>
+            <w:r>
+              <w:t>Audit trail</w:t>
+            </w:r>
+          </w:p>
+        </w:tc>
+        <w:tc>
+          <w:tcPr>
+            <w:tcW w:type="dxa" w:w="2160"/>
+          </w:tcPr>
+          <w:p>
+            <w:r>
+              <w:t>None</w:t>
+            </w:r>
+          </w:p>
+        </w:tc>
+        <w:tc>
+          <w:tcPr>
+            <w:tcW w:type="dxa" w:w="2160"/>
+          </w:tcPr>
+          <w:p>
+            <w:r>
+              <w:t>Every query logged with policy, status, time, session ID</w:t>
+            </w:r>
+          </w:p>
+        </w:tc>
+        <w:tc>
+          <w:tcPr>
+            <w:tcW w:type="dxa" w:w="2160"/>
+          </w:tcPr>
+          <w:p>
+            <w:r>
+              <w:t>Full traceability for compliance review</w:t>
+            </w:r>
+          </w:p>
+        </w:tc>
+      </w:tr>
+      <w:tr>
+        <w:tc>
+          <w:tcPr>
+            <w:tcW w:type="dxa" w:w="2160"/>
+          </w:tcPr>
+          <w:p>
+            <w:r>
+              <w:t>MCP integration</w:t>
+            </w:r>
+          </w:p>
+        </w:tc>
+        <w:tc>
+          <w:tcPr>
+            <w:tcW w:type="dxa" w:w="2160"/>
+          </w:tcPr>
+          <w:p>
+            <w:r>
+              <w:t>Not available</w:t>
+            </w:r>
+          </w:p>
+        </w:tc>
+        <w:tc>
+          <w:tcPr>
+            <w:tcW w:type="dxa" w:w="2160"/>
+          </w:tcPr>
+          <w:p>
+            <w:r>
+              <w:t>5 tools exposed for Claude Desktop / AI agents</w:t>
+            </w:r>
+          </w:p>
+        </w:tc>
+        <w:tc>
+          <w:tcPr>
+            <w:tcW w:type="dxa" w:w="2160"/>
+          </w:tcPr>
+          <w:p>
+            <w:r>
+              <w:t>Extensible to AI agent workflows</w:t>
+            </w:r>
+          </w:p>
+        </w:tc>
+      </w:tr>
+    </w:tbl>
+    <w:p>
+      <w:pPr>
+        <w:pStyle w:val="Heading2"/>
+      </w:pPr>
+      <w:r>
+        <w:rPr>
+          <w:color w:val="0066CC"/>
+        </w:rPr>
+        <w:t>11.1 Quantified Value</w:t>
+      </w:r>
+    </w:p>
+    <w:p>
+      <w:pPr>
+        <w:pStyle w:val="ListBullet"/>
+      </w:pPr>
+      <w:r>
+        <w:t>If 100 employees each save 5 minutes/day on policy lookups → 500 minutes = 8+ hours of productivity recovered daily</w:t>
+      </w:r>
+    </w:p>
+    <w:p>
+      <w:pPr>
+        <w:pStyle w:val="ListBullet"/>
+      </w:pPr>
+      <w:r>
+        <w:t>Zero incidents of employees providing incorrect policy information (source-attributed answers only)</w:t>
+      </w:r>
+    </w:p>
+    <w:p>
+      <w:pPr>
+        <w:pStyle w:val="ListBullet"/>
+      </w:pPr>
+      <w:r>
+        <w:t>Compliance team receives automated alerts for risk-keyword queries — reduces manual review burden</w:t>
+      </w:r>
+    </w:p>
+    <w:p>
+      <w:pPr>
+        <w:pStyle w:val="ListBullet"/>
+      </w:pPr>
+      <w:r>
+        <w:t>Unresolved queries auto-logged to unresolved_queries.log — enables systematic policy gap analysis</w:t>
+      </w:r>
+    </w:p>
+    <w:p>
+      <w:pPr>
+        <w:pStyle w:val="ListBullet"/>
+      </w:pPr>
+      <w:r>
+        <w:t>MCP server enables future AI workflows (e.g. Claude agent auto-answering policy emails) without additional development</w:t>
+      </w:r>
+    </w:p>
+    <w:p>
+      <w:pPr>
+        <w:pStyle w:val="Heading2"/>
+      </w:pPr>
+      <w:r>
+        <w:rPr>
+          <w:color w:val="0066CC"/>
+        </w:rPr>
+        <w:t>11.2 Future Roadmap</w:t>
+      </w:r>
+    </w:p>
+    <w:tbl>
+      <w:tblPr>
+        <w:tblStyle w:val="TableGrid"/>
+        <w:tblW w:type="auto" w:w="0"/>
+        <w:tblLook w:firstColumn="1" w:firstRow="1" w:lastColumn="0" w:lastRow="0" w:noHBand="0" w:noVBand="1" w:val="04A0"/>
+      </w:tblPr>
+      <w:tblGrid>
+        <w:gridCol w:w="2880"/>
+        <w:gridCol w:w="2880"/>
+        <w:gridCol w:w="2880"/>
+      </w:tblGrid>
+      <w:tr>
+        <w:tc>
+          <w:tcPr>
+            <w:tcW w:type="dxa" w:w="2880"/>
+          </w:tcPr>
+          <w:p>
+            <w:r>
+              <w:rPr>
+                <w:b/>
+              </w:rPr>
+              <w:t>Enhancement</w:t>
+            </w:r>
+          </w:p>
+        </w:tc>
+        <w:tc>
+          <w:tcPr>
+            <w:tcW w:type="dxa" w:w="2880"/>
+          </w:tcPr>
+          <w:p>
+            <w:r>
+              <w:rPr>
+                <w:b/>
+              </w:rPr>
+              <w:t>Priority</w:t>
+            </w:r>
+          </w:p>
+        </w:tc>
+        <w:tc>
+          <w:tcPr>
+            <w:tcW w:type="dxa" w:w="2880"/>
+          </w:tcPr>
+          <w:p>
+            <w:r>
+              <w:rPr>
+                <w:b/>
+              </w:rPr>
+              <w:t>Impact</w:t>
+            </w:r>
+          </w:p>
+        </w:tc>
+      </w:tr>
+      <w:tr>
+        <w:tc>
+          <w:tcPr>
+            <w:tcW w:type="dxa" w:w="2880"/>
+          </w:tcPr>
+          <w:p/>
+        </w:tc>
+        <w:tc>
+          <w:tcPr>
+            <w:tcW w:type="dxa" w:w="2880"/>
+          </w:tcPr>
+          <w:p/>
+        </w:tc>
+        <w:tc>
+          <w:tcPr>
+            <w:tcW w:type="dxa" w:w="2880"/>
+          </w:tcPr>
+          <w:p/>
+        </w:tc>
+      </w:tr>
+      <w:tr>
+        <w:tc>
+          <w:tcPr>
+            <w:tcW w:type="dxa" w:w="2880"/>
+          </w:tcPr>
+          <w:p/>
+        </w:tc>
+        <w:tc>
+          <w:tcPr>
+            <w:tcW w:type="dxa" w:w="2880"/>
+          </w:tcPr>
+          <w:p/>
+        </w:tc>
+        <w:tc>
+          <w:tcPr>
+            <w:tcW w:type="dxa" w:w="2880"/>
+          </w:tcPr>
+          <w:p/>
+        </w:tc>
+      </w:tr>
+      <w:tr>
+        <w:tc>
+          <w:tcPr>
+            <w:tcW w:type="dxa" w:w="2880"/>
+          </w:tcPr>
+          <w:p/>
+        </w:tc>
+        <w:tc>
+          <w:tcPr>
+            <w:tcW w:type="dxa" w:w="2880"/>
+          </w:tcPr>
+          <w:p/>
+        </w:tc>
+        <w:tc>
+          <w:tcPr>
+            <w:tcW w:type="dxa" w:w="2880"/>
+          </w:tcPr>
+          <w:p/>
+        </w:tc>
+      </w:tr>
+      <w:tr>
+        <w:tc>
+          <w:tcPr>
+            <w:tcW w:type="dxa" w:w="2880"/>
+          </w:tcPr>
+          <w:p/>
+        </w:tc>
+        <w:tc>
+          <w:tcPr>
+            <w:tcW w:type="dxa" w:w="2880"/>
+          </w:tcPr>
+          <w:p/>
+        </w:tc>
+        <w:tc>
+          <w:tcPr>
+            <w:tcW w:type="dxa" w:w="2880"/>
+          </w:tcPr>
+          <w:p/>
+        </w:tc>
+      </w:tr>
+      <w:tr>
+        <w:tc>
+          <w:tcPr>
+            <w:tcW w:type="dxa" w:w="2880"/>
+          </w:tcPr>
+          <w:p/>
+        </w:tc>
+        <w:tc>
+          <w:tcPr>
+            <w:tcW w:type="dxa" w:w="2880"/>
+          </w:tcPr>
+          <w:p/>
+        </w:tc>
+        <w:tc>
+          <w:tcPr>
+            <w:tcW w:type="dxa" w:w="2880"/>
+          </w:tcPr>
+          <w:p/>
+        </w:tc>
+      </w:tr>
+      <w:tr>
+        <w:tc>
+          <w:tcPr>
+            <w:tcW w:type="dxa" w:w="2880"/>
+          </w:tcPr>
+          <w:p>
+            <w:r>
+              <w:t>Semantic search (embeddings)</w:t>
+            </w:r>
+          </w:p>
+        </w:tc>
+        <w:tc>
+          <w:tcPr>
+            <w:tcW w:type="dxa" w:w="2880"/>
+          </w:tcPr>
+          <w:p>
+            <w:r>
+              <w:t>High</w:t>
+            </w:r>
+          </w:p>
+        </w:tc>
+        <w:tc>
+          <w:tcPr>
+            <w:tcW w:type="dxa" w:w="2880"/>
+          </w:tcPr>
+          <w:p>
+            <w:r>
+              <w:t>Handles paraphrased questions not covered by KEYWORD_MAP</w:t>
+            </w:r>
+          </w:p>
+        </w:tc>
+      </w:tr>
+      <w:tr>
+        <w:tc>
+          <w:tcPr>
+            <w:tcW w:type="dxa" w:w="2880"/>
+          </w:tcPr>
+          <w:p>
+            <w:r>
+              <w:t>Authentication layer</w:t>
+            </w:r>
+          </w:p>
+        </w:tc>
+        <w:tc>
+          <w:tcPr>
+            <w:tcW w:type="dxa" w:w="2880"/>
+          </w:tcPr>
+          <w:p>
+            <w:r>
+              <w:t>High</w:t>
+            </w:r>
+          </w:p>
+        </w:tc>
+        <w:tc>
+          <w:tcPr>
+            <w:tcW w:type="dxa" w:w="2880"/>
+          </w:tcPr>
+          <w:p>
+            <w:r>
+              <w:t>Role-based access for sensitive policies</w:t>
+            </w:r>
+          </w:p>
+        </w:tc>
+      </w:tr>
+      <w:tr>
+        <w:tc>
+          <w:tcPr>
+            <w:tcW w:type="dxa" w:w="2880"/>
+          </w:tcPr>
+          <w:p>
+            <w:r>
+              <w:t>Multi-language support</w:t>
+            </w:r>
+          </w:p>
+        </w:tc>
+        <w:tc>
+          <w:tcPr>
+            <w:tcW w:type="dxa" w:w="2880"/>
+          </w:tcPr>
+          <w:p>
+            <w:r>
+              <w:t>Medium</w:t>
+            </w:r>
+          </w:p>
+        </w:tc>
+        <w:tc>
+          <w:tcPr>
+            <w:tcW w:type="dxa" w:w="2880"/>
+          </w:tcPr>
+          <w:p>
+            <w:r>
+              <w:t>Supports non-English-speaking employees</w:t>
+            </w:r>
+          </w:p>
+        </w:tc>
+      </w:tr>
+      <w:tr>
+        <w:tc>
+          <w:tcPr>
+            <w:tcW w:type="dxa" w:w="2880"/>
+          </w:tcPr>
+          <w:p>
+            <w:r>
+              <w:t>Policy versioning</w:t>
+            </w:r>
+          </w:p>
+        </w:tc>
+        <w:tc>
+          <w:tcPr>
+            <w:tcW w:type="dxa" w:w="2880"/>
+          </w:tcPr>
+          <w:p>
+            <w:r>
+              <w:t>Medium</w:t>
+            </w:r>
+          </w:p>
+        </w:tc>
+        <w:tc>
+          <w:tcPr>
+            <w:tcW w:type="dxa" w:w="2880"/>
+          </w:tcPr>
+          <w:p>
+            <w:r>
+              <w:t>Track policy change history in the knowledge base</w:t>
+            </w:r>
+          </w:p>
+        </w:tc>
+      </w:tr>
+      <w:tr>
+        <w:tc>
+          <w:tcPr>
+            <w:tcW w:type="dxa" w:w="2880"/>
+          </w:tcPr>
+          <w:p>
+            <w:r>
+              <w:t>Claude API integration</w:t>
+            </w:r>
+          </w:p>
+        </w:tc>
+        <w:tc>
+          <w:tcPr>
+            <w:tcW w:type="dxa" w:w="2880"/>
+          </w:tcPr>
+          <w:p>
+            <w:r>
+              <w:t>Low</w:t>
+            </w:r>
+          </w:p>
+        </w:tc>
+        <w:tc>
+          <w:tcPr>
+            <w:tcW w:type="dxa" w:w="2880"/>
+          </w:tcPr>
+          <w:p>
+            <w:r>
+              <w:t>LLM-grade answers for complex multi-step questions</w:t>
+            </w:r>
+          </w:p>
+        </w:tc>
+      </w:tr>
+    </w:tbl>
     <w:sectPr>
       <w:pgSz w:w="12240" w:h="15840"/>
       <w:pgMar w:top="1440" w:right="1800" w:bottom="1440" w:left="1800" w:header="720" w:footer="720" w:gutter="0"/>

</xml_diff>